<commit_message>
docs: User manual with logo, Kinetic Prism theme, v8.3 content
- Logo on title page, version read from version.h (single source of truth)
- Heading colors: LuminaBlue H1, Purple H2, Cyan H3
- New sections: DMX action types, dynamic show generation
- Updated segment cap (64), preset show descriptions
- PDF deployed to electricrv.ca/slyled/SlyLED_User_Manual.pdf
- Website: PDF download link in hero + footer
- deploy.py: fixed overwrite support for existing files
- Refreshed all 18 SPA screenshots

Co-Authored-By: Claude Opus 4.6 (1M context) <noreply@anthropic.com>
</commit_message>
<xml_diff>
--- a/docs/SlyLED_User_Manual.docx
+++ b/docs/SlyLED_User_Manual.docx
@@ -3,6 +3,45 @@
 <w:document xmlns:wpc="http://schemas.microsoft.com/office/word/2010/wordprocessingCanvas" xmlns:mo="http://schemas.microsoft.com/office/mac/office/2008/main" xmlns:mc="http://schemas.openxmlformats.org/markup-compatibility/2006" xmlns:mv="urn:schemas-microsoft-com:mac:vml" xmlns:o="urn:schemas-microsoft-com:office:office" xmlns:r="http://schemas.openxmlformats.org/officeDocument/2006/relationships" xmlns:m="http://schemas.openxmlformats.org/officeDocument/2006/math" xmlns:v="urn:schemas-microsoft-com:vml" xmlns:wp14="http://schemas.microsoft.com/office/word/2010/wordprocessingDrawing" xmlns:wp="http://schemas.openxmlformats.org/drawingml/2006/wordprocessingDrawing" xmlns:w10="urn:schemas-microsoft-com:office:word" xmlns:w="http://schemas.openxmlformats.org/wordprocessingml/2006/main" xmlns:w14="http://schemas.microsoft.com/office/word/2010/wordml" xmlns:wpg="http://schemas.microsoft.com/office/word/2010/wordprocessingGroup" xmlns:wpi="http://schemas.microsoft.com/office/word/2010/wordprocessingInk" xmlns:wne="http://schemas.microsoft.com/office/word/2006/wordml" xmlns:wps="http://schemas.microsoft.com/office/word/2010/wordprocessingShape" mc:Ignorable="w14 wp14">
   <w:body>
     <w:p/>
+    <w:p>
+      <w:pPr>
+        <w:jc w:val="center"/>
+      </w:pPr>
+      <w:r>
+        <w:drawing>
+          <wp:inline xmlns:a="http://schemas.openxmlformats.org/drawingml/2006/main" xmlns:pic="http://schemas.openxmlformats.org/drawingml/2006/picture">
+            <wp:extent cx="2743200" cy="3096077"/>
+            <wp:docPr id="1" name="Picture 1"/>
+            <wp:cNvGraphicFramePr>
+              <a:graphicFrameLocks noChangeAspect="1"/>
+            </wp:cNvGraphicFramePr>
+            <a:graphic>
+              <a:graphicData uri="http://schemas.openxmlformats.org/drawingml/2006/picture">
+                <pic:pic>
+                  <pic:nvPicPr>
+                    <pic:cNvPr id="0" name="slyled.png"/>
+                    <pic:cNvPicPr/>
+                  </pic:nvPicPr>
+                  <pic:blipFill>
+                    <a:blip r:embed="rId9"/>
+                    <a:stretch>
+                      <a:fillRect/>
+                    </a:stretch>
+                  </pic:blipFill>
+                  <pic:spPr>
+                    <a:xfrm>
+                      <a:off x="0" y="0"/>
+                      <a:ext cx="2743200" cy="3096077"/>
+                    </a:xfrm>
+                    <a:prstGeom prst="rect"/>
+                  </pic:spPr>
+                </pic:pic>
+              </a:graphicData>
+            </a:graphic>
+          </wp:inline>
+        </w:drawing>
+      </w:r>
+    </w:p>
     <w:p/>
     <w:p>
       <w:pPr>
@@ -10,6 +49,10 @@
         <w:jc w:val="center"/>
       </w:pPr>
       <w:r>
+        <w:rPr>
+          <w:color w:val="38BDF8"/>
+          <w:sz w:val="72"/>
+        </w:rPr>
         <w:t>SlyLED User Manual</w:t>
       </w:r>
     </w:p>
@@ -22,7 +65,7 @@
           <w:color w:val="64748B"/>
           <w:sz w:val="32"/>
         </w:rPr>
-        <w:t>3D Volumetric Lighting System — v7.6</w:t>
+        <w:t>3D Volumetric Lighting System — v8.3.0</w:t>
       </w:r>
     </w:p>
     <w:p/>
@@ -31,7 +74,23 @@
         <w:jc w:val="center"/>
       </w:pPr>
       <w:r>
+        <w:rPr>
+          <w:color w:val="333333"/>
+        </w:rPr>
         <w:t>Complete guide to designing, programming, and running LED + DMX lighting shows with the SlyLED orchestrator, performers, and DMX bridge.</w:t>
+      </w:r>
+    </w:p>
+    <w:p/>
+    <w:p>
+      <w:pPr>
+        <w:jc w:val="center"/>
+      </w:pPr>
+      <w:r>
+        <w:rPr>
+          <w:color w:val="22D3EE"/>
+          <w:sz w:val="22"/>
+        </w:rPr>
+        <w:t>electricrv.ca/slyled</w:t>
       </w:r>
     </w:p>
     <w:p>
@@ -177,7 +236,7 @@
         <w:drawing>
           <wp:inline xmlns:a="http://schemas.openxmlformats.org/drawingml/2006/main" xmlns:pic="http://schemas.openxmlformats.org/drawingml/2006/picture">
             <wp:extent cx="5486400" cy="3429000"/>
-            <wp:docPr id="1" name="Picture 1"/>
+            <wp:docPr id="2" name="Picture 2"/>
             <wp:cNvGraphicFramePr>
               <a:graphicFrameLocks noChangeAspect="1"/>
             </wp:cNvGraphicFramePr>
@@ -189,7 +248,7 @@
                     <pic:cNvPicPr/>
                   </pic:nvPicPr>
                   <pic:blipFill>
-                    <a:blip r:embed="rId9"/>
+                    <a:blip r:embed="rId10"/>
                     <a:stretch>
                       <a:fillRect/>
                     </a:stretch>
@@ -249,7 +308,7 @@
         <w:drawing>
           <wp:inline xmlns:a="http://schemas.openxmlformats.org/drawingml/2006/main" xmlns:pic="http://schemas.openxmlformats.org/drawingml/2006/picture">
             <wp:extent cx="5486400" cy="3429000"/>
-            <wp:docPr id="2" name="Picture 2"/>
+            <wp:docPr id="3" name="Picture 3"/>
             <wp:cNvGraphicFramePr>
               <a:graphicFrameLocks noChangeAspect="1"/>
             </wp:cNvGraphicFramePr>
@@ -261,7 +320,7 @@
                     <pic:cNvPicPr/>
                   </pic:nvPicPr>
                   <pic:blipFill>
-                    <a:blip r:embed="rId10"/>
+                    <a:blip r:embed="rId11"/>
                     <a:stretch>
                       <a:fillRect/>
                     </a:stretch>
@@ -301,7 +360,7 @@
         <w:drawing>
           <wp:inline xmlns:a="http://schemas.openxmlformats.org/drawingml/2006/main" xmlns:pic="http://schemas.openxmlformats.org/drawingml/2006/picture">
             <wp:extent cx="5486400" cy="3429000"/>
-            <wp:docPr id="3" name="Picture 3"/>
+            <wp:docPr id="4" name="Picture 4"/>
             <wp:cNvGraphicFramePr>
               <a:graphicFrameLocks noChangeAspect="1"/>
             </wp:cNvGraphicFramePr>
@@ -313,7 +372,7 @@
                     <pic:cNvPicPr/>
                   </pic:nvPicPr>
                   <pic:blipFill>
-                    <a:blip r:embed="rId11"/>
+                    <a:blip r:embed="rId12"/>
                     <a:stretch>
                       <a:fillRect/>
                     </a:stretch>
@@ -611,7 +670,7 @@
         <w:drawing>
           <wp:inline xmlns:a="http://schemas.openxmlformats.org/drawingml/2006/main" xmlns:pic="http://schemas.openxmlformats.org/drawingml/2006/picture">
             <wp:extent cx="5486400" cy="3429000"/>
-            <wp:docPr id="4" name="Picture 4"/>
+            <wp:docPr id="5" name="Picture 5"/>
             <wp:cNvGraphicFramePr>
               <a:graphicFrameLocks noChangeAspect="1"/>
             </wp:cNvGraphicFramePr>
@@ -623,7 +682,7 @@
                     <pic:cNvPicPr/>
                   </pic:nvPicPr>
                   <pic:blipFill>
-                    <a:blip r:embed="rId12"/>
+                    <a:blip r:embed="rId13"/>
                     <a:stretch>
                       <a:fillRect/>
                     </a:stretch>
@@ -676,7 +735,7 @@
         <w:drawing>
           <wp:inline xmlns:a="http://schemas.openxmlformats.org/drawingml/2006/main" xmlns:pic="http://schemas.openxmlformats.org/drawingml/2006/picture">
             <wp:extent cx="5486400" cy="3429000"/>
-            <wp:docPr id="5" name="Picture 5"/>
+            <wp:docPr id="6" name="Picture 6"/>
             <wp:cNvGraphicFramePr>
               <a:graphicFrameLocks noChangeAspect="1"/>
             </wp:cNvGraphicFramePr>
@@ -688,7 +747,7 @@
                     <pic:cNvPicPr/>
                   </pic:nvPicPr>
                   <pic:blipFill>
-                    <a:blip r:embed="rId13"/>
+                    <a:blip r:embed="rId14"/>
                     <a:stretch>
                       <a:fillRect/>
                     </a:stretch>
@@ -754,7 +813,7 @@
         <w:drawing>
           <wp:inline xmlns:a="http://schemas.openxmlformats.org/drawingml/2006/main" xmlns:pic="http://schemas.openxmlformats.org/drawingml/2006/picture">
             <wp:extent cx="5486400" cy="3429000"/>
-            <wp:docPr id="6" name="Picture 6"/>
+            <wp:docPr id="7" name="Picture 7"/>
             <wp:cNvGraphicFramePr>
               <a:graphicFrameLocks noChangeAspect="1"/>
             </wp:cNvGraphicFramePr>
@@ -762,7 +821,7 @@
               <a:graphicData uri="http://schemas.openxmlformats.org/drawingml/2006/picture">
                 <pic:pic>
                   <pic:nvPicPr>
-                    <pic:cNvPr id="0" name="spa-setup-add-dmx.png"/>
+                    <pic:cNvPr id="0" name="spa-setup-add-led.png"/>
                     <pic:cNvPicPr/>
                   </pic:nvPicPr>
                   <pic:blipFill>
@@ -829,7 +888,7 @@
         <w:drawing>
           <wp:inline xmlns:a="http://schemas.openxmlformats.org/drawingml/2006/main" xmlns:pic="http://schemas.openxmlformats.org/drawingml/2006/picture">
             <wp:extent cx="5486400" cy="3429000"/>
-            <wp:docPr id="7" name="Picture 7"/>
+            <wp:docPr id="8" name="Picture 8"/>
             <wp:cNvGraphicFramePr>
               <a:graphicFrameLocks noChangeAspect="1"/>
             </wp:cNvGraphicFramePr>
@@ -1089,7 +1148,7 @@
         <w:drawing>
           <wp:inline xmlns:a="http://schemas.openxmlformats.org/drawingml/2006/main" xmlns:pic="http://schemas.openxmlformats.org/drawingml/2006/picture">
             <wp:extent cx="5486400" cy="3429000"/>
-            <wp:docPr id="8" name="Picture 8"/>
+            <wp:docPr id="9" name="Picture 9"/>
             <wp:cNvGraphicFramePr>
               <a:graphicFrameLocks noChangeAspect="1"/>
             </wp:cNvGraphicFramePr>
@@ -1381,6 +1440,152 @@
       </w:r>
     </w:p>
     <w:p>
+      <w:pPr>
+        <w:pStyle w:val="Heading2"/>
+      </w:pPr>
+      <w:r>
+        <w:t>DMX Action Types</w:t>
+      </w:r>
+    </w:p>
+    <w:p>
+      <w:r>
+        <w:t>In addition to classic LED actions (Solid, Chase, Rainbow, etc.), four DMX-specific action types are available for direct control of DMX features:</w:t>
+      </w:r>
+    </w:p>
+    <w:tbl>
+      <w:tblPr>
+        <w:tblStyle w:val="LightGrid-Accent1"/>
+        <w:tblW w:type="auto" w:w="0"/>
+        <w:jc w:val="center"/>
+        <w:tblLook w:firstColumn="1" w:firstRow="1" w:lastColumn="0" w:lastRow="0" w:noHBand="0" w:noVBand="1" w:val="04A0"/>
+      </w:tblPr>
+      <w:tblGrid>
+        <w:gridCol w:w="4320"/>
+        <w:gridCol w:w="4320"/>
+      </w:tblGrid>
+      <w:tr>
+        <w:tc>
+          <w:tcPr>
+            <w:tcW w:type="dxa" w:w="4320"/>
+          </w:tcPr>
+          <w:p>
+            <w:r>
+              <w:rPr>
+                <w:b/>
+              </w:rPr>
+              <w:t>Action Type</w:t>
+            </w:r>
+          </w:p>
+        </w:tc>
+        <w:tc>
+          <w:tcPr>
+            <w:tcW w:type="dxa" w:w="4320"/>
+          </w:tcPr>
+          <w:p>
+            <w:r>
+              <w:rPr>
+                <w:b/>
+              </w:rPr>
+              <w:t>Description</w:t>
+            </w:r>
+          </w:p>
+        </w:tc>
+      </w:tr>
+      <w:tr>
+        <w:tc>
+          <w:tcPr>
+            <w:tcW w:type="dxa" w:w="4320"/>
+          </w:tcPr>
+          <w:p>
+            <w:r>
+              <w:t>DMX Scene</w:t>
+            </w:r>
+          </w:p>
+        </w:tc>
+        <w:tc>
+          <w:tcPr>
+            <w:tcW w:type="dxa" w:w="4320"/>
+          </w:tcPr>
+          <w:p>
+            <w:r>
+              <w:t>Set exact values for dimmer, pan, tilt, strobe, gobo, color wheel, prism</w:t>
+            </w:r>
+          </w:p>
+        </w:tc>
+      </w:tr>
+      <w:tr>
+        <w:tc>
+          <w:tcPr>
+            <w:tcW w:type="dxa" w:w="4320"/>
+          </w:tcPr>
+          <w:p>
+            <w:r>
+              <w:t>Pan/Tilt Move</w:t>
+            </w:r>
+          </w:p>
+        </w:tc>
+        <w:tc>
+          <w:tcPr>
+            <w:tcW w:type="dxa" w:w="4320"/>
+          </w:tcPr>
+          <w:p>
+            <w:r>
+              <w:t>Animate pan/tilt from start to end position over time</w:t>
+            </w:r>
+          </w:p>
+        </w:tc>
+      </w:tr>
+      <w:tr>
+        <w:tc>
+          <w:tcPr>
+            <w:tcW w:type="dxa" w:w="4320"/>
+          </w:tcPr>
+          <w:p>
+            <w:r>
+              <w:t>Gobo Select</w:t>
+            </w:r>
+          </w:p>
+        </w:tc>
+        <w:tc>
+          <w:tcPr>
+            <w:tcW w:type="dxa" w:w="4320"/>
+          </w:tcPr>
+          <w:p>
+            <w:r>
+              <w:t>Select a gobo wheel position with optional color</w:t>
+            </w:r>
+          </w:p>
+        </w:tc>
+      </w:tr>
+      <w:tr>
+        <w:tc>
+          <w:tcPr>
+            <w:tcW w:type="dxa" w:w="4320"/>
+          </w:tcPr>
+          <w:p>
+            <w:r>
+              <w:t>Color Wheel</w:t>
+            </w:r>
+          </w:p>
+        </w:tc>
+        <w:tc>
+          <w:tcPr>
+            <w:tcW w:type="dxa" w:w="4320"/>
+          </w:tcPr>
+          <w:p>
+            <w:r>
+              <w:t>Select a color wheel position</w:t>
+            </w:r>
+          </w:p>
+        </w:tc>
+      </w:tr>
+    </w:tbl>
+    <w:p>
+      <w:r>
+        <w:t>Classic LED actions (Solid, Breathe, Chase, etc.) are automatically converted to DMX Scene segments when assigned to DMX fixtures. The dimmer is auto-set to 255 when color is active, and pan/tilt default to center (0.5).</w:t>
+      </w:r>
+    </w:p>
+    <w:p>
       <w:r>
         <w:br w:type="page"/>
       </w:r>
@@ -1406,7 +1611,7 @@
         <w:drawing>
           <wp:inline xmlns:a="http://schemas.openxmlformats.org/drawingml/2006/main" xmlns:pic="http://schemas.openxmlformats.org/drawingml/2006/picture">
             <wp:extent cx="5486400" cy="3429000"/>
-            <wp:docPr id="9" name="Picture 9"/>
+            <wp:docPr id="10" name="Picture 10"/>
             <wp:cNvGraphicFramePr>
               <a:graphicFrameLocks noChangeAspect="1"/>
             </wp:cNvGraphicFramePr>
@@ -1571,7 +1776,10 @@
     </w:p>
     <w:p>
       <w:r>
-        <w:t>14 pre-built shows are available from Settings or the Runtime tab:</w:t>
+        <w:t>14 themed shows are available from the Runtime tab. Shows are dynamically generated based on your actual fixtures — every fixture gets coverage with no dark periods. LED fixtures get pattern effects, DMX pars get color washes, and moving heads get pan/tilt sweeps that track spatial effects across the stage.</w:t>
+        <w:br/>
+        <w:br/>
+        <w:t>Each load produces a unique variation of the theme with randomized timing and positions.</w:t>
       </w:r>
     </w:p>
     <w:tbl>
@@ -2102,7 +2310,7 @@
         <w:drawing>
           <wp:inline xmlns:a="http://schemas.openxmlformats.org/drawingml/2006/main" xmlns:pic="http://schemas.openxmlformats.org/drawingml/2006/picture">
             <wp:extent cx="5486400" cy="3429000"/>
-            <wp:docPr id="10" name="Picture 10"/>
+            <wp:docPr id="11" name="Picture 11"/>
             <wp:cNvGraphicFramePr>
               <a:graphicFrameLocks noChangeAspect="1"/>
             </wp:cNvGraphicFramePr>
@@ -2167,7 +2375,7 @@
         <w:drawing>
           <wp:inline xmlns:a="http://schemas.openxmlformats.org/drawingml/2006/main" xmlns:pic="http://schemas.openxmlformats.org/drawingml/2006/picture">
             <wp:extent cx="5486400" cy="3429000"/>
-            <wp:docPr id="11" name="Picture 11"/>
+            <wp:docPr id="12" name="Picture 12"/>
             <wp:cNvGraphicFramePr>
               <a:graphicFrameLocks noChangeAspect="1"/>
             </wp:cNvGraphicFramePr>
@@ -2232,7 +2440,7 @@
         <w:drawing>
           <wp:inline xmlns:a="http://schemas.openxmlformats.org/drawingml/2006/main" xmlns:pic="http://schemas.openxmlformats.org/drawingml/2006/picture">
             <wp:extent cx="5486400" cy="3429000"/>
-            <wp:docPr id="12" name="Picture 12"/>
+            <wp:docPr id="13" name="Picture 13"/>
             <wp:cNvGraphicFramePr>
               <a:graphicFrameLocks noChangeAspect="1"/>
             </wp:cNvGraphicFramePr>
@@ -2284,7 +2492,7 @@
         <w:drawing>
           <wp:inline xmlns:a="http://schemas.openxmlformats.org/drawingml/2006/main" xmlns:pic="http://schemas.openxmlformats.org/drawingml/2006/picture">
             <wp:extent cx="5486400" cy="3429000"/>
-            <wp:docPr id="13" name="Picture 13"/>
+            <wp:docPr id="14" name="Picture 14"/>
             <wp:cNvGraphicFramePr>
               <a:graphicFrameLocks noChangeAspect="1"/>
             </wp:cNvGraphicFramePr>
@@ -2349,7 +2557,7 @@
         <w:drawing>
           <wp:inline xmlns:a="http://schemas.openxmlformats.org/drawingml/2006/main" xmlns:pic="http://schemas.openxmlformats.org/drawingml/2006/picture">
             <wp:extent cx="5486400" cy="3429000"/>
-            <wp:docPr id="14" name="Picture 14"/>
+            <wp:docPr id="15" name="Picture 15"/>
             <wp:cNvGraphicFramePr>
               <a:graphicFrameLocks noChangeAspect="1"/>
             </wp:cNvGraphicFramePr>
@@ -2427,7 +2635,7 @@
         <w:drawing>
           <wp:inline xmlns:a="http://schemas.openxmlformats.org/drawingml/2006/main" xmlns:pic="http://schemas.openxmlformats.org/drawingml/2006/picture">
             <wp:extent cx="5486400" cy="3429000"/>
-            <wp:docPr id="15" name="Picture 15"/>
+            <wp:docPr id="16" name="Picture 16"/>
             <wp:cNvGraphicFramePr>
               <a:graphicFrameLocks noChangeAspect="1"/>
             </wp:cNvGraphicFramePr>
@@ -2510,7 +2718,7 @@
         <w:drawing>
           <wp:inline xmlns:a="http://schemas.openxmlformats.org/drawingml/2006/main" xmlns:pic="http://schemas.openxmlformats.org/drawingml/2006/picture">
             <wp:extent cx="5486400" cy="3429000"/>
-            <wp:docPr id="16" name="Picture 16"/>
+            <wp:docPr id="17" name="Picture 17"/>
             <wp:cNvGraphicFramePr>
               <a:graphicFrameLocks noChangeAspect="1"/>
             </wp:cNvGraphicFramePr>
@@ -2778,7 +2986,7 @@
           </w:tcPr>
           <w:p>
             <w:r>
-              <w:t>16 max</w:t>
+              <w:t>64 max</w:t>
             </w:r>
           </w:p>
         </w:tc>
@@ -2788,7 +2996,7 @@
           </w:tcPr>
           <w:p>
             <w:r>
-              <w:t>Fits runner step limit</w:t>
+              <w:t>Supports PT move time slices</w:t>
             </w:r>
           </w:p>
         </w:tc>
@@ -4279,7 +4487,7 @@
     <w:rsid w:val="00FC693F"/>
     <w:rPr>
       <w:rFonts w:ascii="Calibri" w:hAnsi="Calibri"/>
-      <w:color w:val="222222"/>
+      <w:color w:val="333333"/>
       <w:sz w:val="22"/>
     </w:rPr>
   </w:style>
@@ -4342,11 +4550,11 @@
       <w:outlineLvl w:val="0"/>
     </w:pPr>
     <w:rPr>
-      <w:rFonts w:asciiTheme="majorHAnsi" w:eastAsiaTheme="majorEastAsia" w:hAnsiTheme="majorHAnsi" w:cstheme="majorBidi"/>
+      <w:rFonts w:asciiTheme="majorHAnsi" w:eastAsiaTheme="majorEastAsia" w:hAnsiTheme="majorHAnsi" w:cstheme="majorBidi" w:ascii="Calibri" w:hAnsi="Calibri"/>
       <w:b/>
       <w:bCs/>
-      <w:color w:val="1E3A5F"/>
-      <w:sz w:val="28"/>
+      <w:color w:val="38BDF8"/>
+      <w:sz w:val="44"/>
       <w:szCs w:val="28"/>
     </w:rPr>
   </w:style>
@@ -4366,11 +4574,11 @@
       <w:outlineLvl w:val="1"/>
     </w:pPr>
     <w:rPr>
-      <w:rFonts w:asciiTheme="majorHAnsi" w:eastAsiaTheme="majorEastAsia" w:hAnsiTheme="majorHAnsi" w:cstheme="majorBidi"/>
+      <w:rFonts w:asciiTheme="majorHAnsi" w:eastAsiaTheme="majorEastAsia" w:hAnsiTheme="majorHAnsi" w:cstheme="majorBidi" w:ascii="Calibri" w:hAnsi="Calibri"/>
       <w:b/>
       <w:bCs/>
-      <w:color w:val="1E3A5F"/>
-      <w:sz w:val="26"/>
+      <w:color w:val="7C3AED"/>
+      <w:sz w:val="30"/>
       <w:szCs w:val="26"/>
     </w:rPr>
   </w:style>
@@ -4390,10 +4598,11 @@
       <w:outlineLvl w:val="2"/>
     </w:pPr>
     <w:rPr>
-      <w:rFonts w:asciiTheme="majorHAnsi" w:eastAsiaTheme="majorEastAsia" w:hAnsiTheme="majorHAnsi" w:cstheme="majorBidi"/>
+      <w:rFonts w:asciiTheme="majorHAnsi" w:eastAsiaTheme="majorEastAsia" w:hAnsiTheme="majorHAnsi" w:cstheme="majorBidi" w:ascii="Calibri" w:hAnsi="Calibri"/>
       <w:b/>
       <w:bCs/>
-      <w:color w:val="1E3A5F"/>
+      <w:color w:val="22D3EE"/>
+      <w:sz w:val="26"/>
     </w:rPr>
   </w:style>
   <w:style w:type="paragraph" w:styleId="Heading4">

</xml_diff>

<commit_message>
release: v8.4.0 — i18n, layout toolbar, Android cleanup, performer→device rename
- Website: EN/FR language toggle with localStorage persistence
- French user manual (PDF + DOCX)
- Layout toolbar: icon-only save, auto-arrange DMX, show strings toggle
- Auto-Arrange DMX: evenly spaces fixtures at stage top, aimed down
- Android: "Performers" renamed to "Devices/Fixtures" across all screens
- Android: removed 24 legacy runner/flight/show endpoints + models
- Added POST /api/show/demo endpoint
- SPA localization: all toolbar strings in L table
- 18 fresh screenshots, both manuals rebuilt

Co-Authored-By: Claude Opus 4.6 (1M context) <noreply@anthropic.com>
</commit_message>
<xml_diff>
--- a/docs/SlyLED_User_Manual.docx
+++ b/docs/SlyLED_User_Manual.docx
@@ -65,7 +65,7 @@
           <w:color w:val="64748B"/>
           <w:sz w:val="32"/>
         </w:rPr>
-        <w:t>3D Volumetric Lighting System — v8.3.0</w:t>
+        <w:t>3D Volumetric Lighting System — v8.4.0</w:t>
       </w:r>
     </w:p>
     <w:p/>
@@ -821,11 +821,11 @@
               <a:graphicData uri="http://schemas.openxmlformats.org/drawingml/2006/picture">
                 <pic:pic>
                   <pic:nvPicPr>
-                    <pic:cNvPr id="0" name="spa-setup-add-led.png"/>
+                    <pic:cNvPr id="0" name="spa-setup-add-dmx.png"/>
                     <pic:cNvPicPr/>
                   </pic:nvPicPr>
                   <pic:blipFill>
-                    <a:blip r:embed="rId14"/>
+                    <a:blip r:embed="rId15"/>
                     <a:stretch>
                       <a:fillRect/>
                     </a:stretch>
@@ -900,7 +900,7 @@
                     <pic:cNvPicPr/>
                   </pic:nvPicPr>
                   <pic:blipFill>
-                    <a:blip r:embed="rId15"/>
+                    <a:blip r:embed="rId16"/>
                     <a:stretch>
                       <a:fillRect/>
                     </a:stretch>
@@ -1160,7 +1160,7 @@
                     <pic:cNvPicPr/>
                   </pic:nvPicPr>
                   <pic:blipFill>
-                    <a:blip r:embed="rId16"/>
+                    <a:blip r:embed="rId17"/>
                     <a:stretch>
                       <a:fillRect/>
                     </a:stretch>
@@ -1623,7 +1623,7 @@
                     <pic:cNvPicPr/>
                   </pic:nvPicPr>
                   <pic:blipFill>
-                    <a:blip r:embed="rId17"/>
+                    <a:blip r:embed="rId18"/>
                     <a:stretch>
                       <a:fillRect/>
                     </a:stretch>
@@ -2322,7 +2322,7 @@
                     <pic:cNvPicPr/>
                   </pic:nvPicPr>
                   <pic:blipFill>
-                    <a:blip r:embed="rId18"/>
+                    <a:blip r:embed="rId19"/>
                     <a:stretch>
                       <a:fillRect/>
                     </a:stretch>
@@ -2387,7 +2387,7 @@
                     <pic:cNvPicPr/>
                   </pic:nvPicPr>
                   <pic:blipFill>
-                    <a:blip r:embed="rId19"/>
+                    <a:blip r:embed="rId20"/>
                     <a:stretch>
                       <a:fillRect/>
                     </a:stretch>
@@ -2452,7 +2452,7 @@
                     <pic:cNvPicPr/>
                   </pic:nvPicPr>
                   <pic:blipFill>
-                    <a:blip r:embed="rId20"/>
+                    <a:blip r:embed="rId21"/>
                     <a:stretch>
                       <a:fillRect/>
                     </a:stretch>
@@ -2504,7 +2504,7 @@
                     <pic:cNvPicPr/>
                   </pic:nvPicPr>
                   <pic:blipFill>
-                    <a:blip r:embed="rId21"/>
+                    <a:blip r:embed="rId22"/>
                     <a:stretch>
                       <a:fillRect/>
                     </a:stretch>
@@ -2569,7 +2569,7 @@
                     <pic:cNvPicPr/>
                   </pic:nvPicPr>
                   <pic:blipFill>
-                    <a:blip r:embed="rId22"/>
+                    <a:blip r:embed="rId23"/>
                     <a:stretch>
                       <a:fillRect/>
                     </a:stretch>
@@ -2647,7 +2647,7 @@
                     <pic:cNvPicPr/>
                   </pic:nvPicPr>
                   <pic:blipFill>
-                    <a:blip r:embed="rId23"/>
+                    <a:blip r:embed="rId24"/>
                     <a:stretch>
                       <a:fillRect/>
                     </a:stretch>
@@ -2730,7 +2730,7 @@
                     <pic:cNvPicPr/>
                   </pic:nvPicPr>
                   <pic:blipFill>
-                    <a:blip r:embed="rId24"/>
+                    <a:blip r:embed="rId25"/>
                     <a:stretch>
                       <a:fillRect/>
                     </a:stretch>

</xml_diff>

<commit_message>
fix: Screenshot capture uses setView() — SPA removed setLayoutMode()
Updated screenshot_capture.py to use setView('front') for 2D and
setView('3d') for 3D layout screenshots. Regenerated all 18 screenshots
and user manual.

Co-Authored-By: Claude Opus 4.6 (1M context) <noreply@anthropic.com>
</commit_message>
<xml_diff>
--- a/docs/SlyLED_User_Manual.docx
+++ b/docs/SlyLED_User_Manual.docx
@@ -65,7 +65,7 @@
           <w:color w:val="64748B"/>
           <w:sz w:val="32"/>
         </w:rPr>
-        <w:t>3D Volumetric Lighting System — v8.4.0</w:t>
+        <w:t>3D Volumetric Lighting System — v1.0.0</w:t>
       </w:r>
     </w:p>
     <w:p/>
@@ -401,7 +401,7 @@
           <w:color w:val="64748B"/>
           <w:sz w:val="18"/>
         </w:rPr>
-        <w:t>Layout tab — 3D Viewport with stage wireframe, fixtures, and surfaces</w:t>
+        <w:t>Layout tab — 3D Viewport with stage wireframe, fixtures, and objects</w:t>
       </w:r>
     </w:p>
     <w:p>
@@ -1064,7 +1064,7 @@
           </w:tcPr>
           <w:p>
             <w:r>
-              <w:t>Surface</w:t>
+              <w:t>Object</w:t>
             </w:r>
           </w:p>
         </w:tc>
@@ -3269,7 +3269,7 @@
     </w:p>
     <w:p>
       <w:r>
-        <w:t>Verify fixture has a profile with panRange/tiltRange &gt; 0. Check aimPoint is set (Edit fixture → Aim Point fields).</w:t>
+        <w:t>Verify fixture has a profile with panRange/tiltRange &gt; 0. Check rotation is set (Edit fixture → Pan/Tilt fields).</w:t>
       </w:r>
     </w:p>
     <w:p>

</xml_diff>

<commit_message>
feat: Person tracking pipeline, camera firmware diagnostics, user manual examples (#373-381)
Track action: fixed field names, fixed assignment mode, temporal objects in
picker, dimmer+color output, playback loop bypass for Track-only timelines.
Camera firmware: Y/Z coordinate swap fix, capture validation on /track/start,
debug diagnostics (/track/debug), warning-level error logging.
User manual: 4 worked examples — camera tracking, mover tracking with spatial
effects, manual mover calibration, ArUco camera calibration.
Updated screenshots, Word/PDF manuals, website pages. 551 tests pass.

Closes #373, #374, #375, #376, #377, #378, #379, #380, #381

Co-Authored-By: Claude Opus 4.6 (1M context) <noreply@anthropic.com>
</commit_message>
<xml_diff>
--- a/docs/SlyLED_User_Manual.docx
+++ b/docs/SlyLED_User_Manual.docx
@@ -183,7 +183,7 @@
         <w:pStyle w:val="ListNumber"/>
       </w:pPr>
       <w:r>
-        <w:t>10. System Limits</w:t>
+        <w:t>10. Camera Setup &amp; Calibration</w:t>
       </w:r>
     </w:p>
     <w:p>
@@ -191,7 +191,7 @@
         <w:pStyle w:val="ListNumber"/>
       </w:pPr>
       <w:r>
-        <w:t>11. Troubleshooting</w:t>
+        <w:t>11. 3D Environment Scanning</w:t>
       </w:r>
     </w:p>
     <w:p>
@@ -199,7 +199,39 @@
         <w:pStyle w:val="ListNumber"/>
       </w:pPr>
       <w:r>
-        <w:t>12. API Quick Reference</w:t>
+        <w:t>12. Stereo 3D &amp; Light Mapping</w:t>
+      </w:r>
+    </w:p>
+    <w:p>
+      <w:pPr>
+        <w:pStyle w:val="ListNumber"/>
+      </w:pPr>
+      <w:r>
+        <w:t>13. Project Files</w:t>
+      </w:r>
+    </w:p>
+    <w:p>
+      <w:pPr>
+        <w:pStyle w:val="ListNumber"/>
+      </w:pPr>
+      <w:r>
+        <w:t>14. System Limits</w:t>
+      </w:r>
+    </w:p>
+    <w:p>
+      <w:pPr>
+        <w:pStyle w:val="ListNumber"/>
+      </w:pPr>
+      <w:r>
+        <w:t>15. Troubleshooting</w:t>
+      </w:r>
+    </w:p>
+    <w:p>
+      <w:pPr>
+        <w:pStyle w:val="ListNumber"/>
+      </w:pPr>
+      <w:r>
+        <w:t>16. API Quick Reference</w:t>
       </w:r>
     </w:p>
     <w:p>
@@ -2785,7 +2817,496 @@
         <w:pStyle w:val="Heading1"/>
       </w:pPr>
       <w:r>
-        <w:t>10. System Limits</w:t>
+        <w:t>10. Camera Setup &amp; Calibration</w:t>
+      </w:r>
+    </w:p>
+    <w:p>
+      <w:pPr>
+        <w:pStyle w:val="Heading2"/>
+      </w:pPr>
+      <w:r>
+        <w:t>Adding Camera Nodes</w:t>
+      </w:r>
+    </w:p>
+    <w:p>
+      <w:r>
+        <w:t>Camera nodes are Orange Pi or Raspberry Pi SBCs running the SlyLED camera firmware. They capture snapshots for calibration, beam detection, depth estimation, and tracking.</w:t>
+        <w:br/>
+        <w:br/>
+        <w:t>To add a camera:</w:t>
+        <w:br/>
+        <w:t>1. Connect the camera node to the same network as the orchestrator</w:t>
+        <w:br/>
+        <w:t>2. Go to Setup tab and click "Discover" — camera nodes respond to UDP broadcast</w:t>
+        <w:br/>
+        <w:t>3. Or manually add via Settings &gt; Cameras with the camera's IP address</w:t>
+        <w:br/>
+        <w:t>4. Each USB camera sensor appears as a separate fixture that can be placed in the Layout</w:t>
+      </w:r>
+    </w:p>
+    <w:p>
+      <w:pPr>
+        <w:jc w:val="center"/>
+      </w:pPr>
+      <w:r>
+        <w:drawing>
+          <wp:inline xmlns:a="http://schemas.openxmlformats.org/drawingml/2006/main" xmlns:pic="http://schemas.openxmlformats.org/drawingml/2006/picture">
+            <wp:extent cx="5486400" cy="3429000"/>
+            <wp:docPr id="18" name="Picture 18"/>
+            <wp:cNvGraphicFramePr>
+              <a:graphicFrameLocks noChangeAspect="1"/>
+            </wp:cNvGraphicFramePr>
+            <a:graphic>
+              <a:graphicData uri="http://schemas.openxmlformats.org/drawingml/2006/picture">
+                <pic:pic>
+                  <pic:nvPicPr>
+                    <pic:cNvPr id="0" name="spa-settings-cameras.png"/>
+                    <pic:cNvPicPr/>
+                  </pic:nvPicPr>
+                  <pic:blipFill>
+                    <a:blip r:embed="rId26"/>
+                    <a:stretch>
+                      <a:fillRect/>
+                    </a:stretch>
+                  </pic:blipFill>
+                  <pic:spPr>
+                    <a:xfrm>
+                      <a:off x="0" y="0"/>
+                      <a:ext cx="5486400" cy="3429000"/>
+                    </a:xfrm>
+                    <a:prstGeom prst="rect"/>
+                  </pic:spPr>
+                </pic:pic>
+              </a:graphicData>
+            </a:graphic>
+          </wp:inline>
+        </w:drawing>
+      </w:r>
+    </w:p>
+    <w:p>
+      <w:pPr>
+        <w:jc w:val="center"/>
+      </w:pPr>
+      <w:r>
+        <w:rPr>
+          <w:i/>
+          <w:color w:val="64748B"/>
+          <w:sz w:val="18"/>
+        </w:rPr>
+        <w:t>Settings &gt; Cameras — camera list with calibration status</w:t>
+      </w:r>
+    </w:p>
+    <w:p>
+      <w:pPr>
+        <w:pStyle w:val="Heading2"/>
+      </w:pPr>
+      <w:r>
+        <w:t>ArUco Marker Calibration</w:t>
+      </w:r>
+    </w:p>
+    <w:p>
+      <w:r>
+        <w:t>ArUco markers are used for camera intrinsic calibration (lens parameters).</w:t>
+        <w:br/>
+        <w:br/>
+        <w:t>Step-by-step:</w:t>
+        <w:br/>
+        <w:t>1. Print ArUco markers: Settings &gt; Cameras &gt; "Print ArUco Markers" (6 markers, 150mm each)</w:t>
+        <w:br/>
+        <w:t>2. Place printed markers on flat surfaces visible to the camera at various angles</w:t>
+        <w:br/>
+        <w:t>3. Click "Capture" 5+ times from different positions — each capture detects markers automatically</w:t>
+        <w:br/>
+        <w:t>4. Click "Compute" — the system runs cv2.calibrateCamera() to determine fx, fy, cx, cy</w:t>
+        <w:br/>
+        <w:t>5. RMS error &lt; 2.0 indicates good calibration</w:t>
+        <w:br/>
+        <w:br/>
+        <w:t>All ArUco detection runs on the orchestrator PC (not the camera hardware), so any camera that can serve JPEG snapshots works — even low-end Raspberry Pi boards.</w:t>
+      </w:r>
+    </w:p>
+    <w:p>
+      <w:pPr>
+        <w:pStyle w:val="Heading2"/>
+      </w:pPr>
+      <w:r>
+        <w:t>Stage Map — Camera Pose</w:t>
+      </w:r>
+    </w:p>
+    <w:p>
+      <w:r>
+        <w:t>The Stage Map determines each camera's 3D position and orientation in stage coordinates using solvePnP with ArUco markers at known stage positions.</w:t>
+        <w:br/>
+        <w:br/>
+        <w:t>Step-by-step:</w:t>
+        <w:br/>
+        <w:t>1. Place 3+ ArUco markers on the stage floor at known positions (measure with tape)</w:t>
+        <w:br/>
+        <w:t>2. Enter each marker's stage coordinates (X, Y, Z in mm) in the wizard</w:t>
+        <w:br/>
+        <w:t>3. Click "Compute Stage Map" — the system detects markers and solves for camera pose</w:t>
+        <w:br/>
+        <w:t>4. Result: camera position in stage mm, floor-plane homography, reprojection error</w:t>
+        <w:br/>
+        <w:br/>
+        <w:t>The homography maps any pixel to stage floor coordinates (X, Y at Z=0), enabling beam detection in real-world millimeters rather than pixel space.</w:t>
+      </w:r>
+    </w:p>
+    <w:p>
+      <w:pPr>
+        <w:pStyle w:val="Heading2"/>
+      </w:pPr>
+      <w:r>
+        <w:t>Mover Calibration Wizard</w:t>
+      </w:r>
+    </w:p>
+    <w:p>
+      <w:r>
+        <w:t>Moving head fixtures need calibration to map DMX pan/tilt values to real-world positions.</w:t>
+        <w:br/>
+        <w:br/>
+        <w:t>The wizard runs automatically:</w:t>
+        <w:br/>
+        <w:t>1. Discovery: Spiral search to find the beam in the camera's field of view</w:t>
+        <w:br/>
+        <w:t>2. Adaptive settle: Waits 0.8-2.5s per move, verifies beam has stopped (double-capture)</w:t>
+        <w:br/>
+        <w:t>3. BFS mapping: Explores visible region, stops at boundaries when beam leaves camera view</w:t>
+        <w:br/>
+        <w:t>4. Grid build: Creates a bilinear interpolation grid for fast pan/tilt lookup</w:t>
+        <w:br/>
+        <w:t>5. Boundary verification: Flash on/off at edges to confirm true visibility limits</w:t>
+        <w:br/>
+        <w:br/>
+        <w:t>After calibration, the system can aim any fixture at any stage coordinate using grid_inverse().</w:t>
+      </w:r>
+    </w:p>
+    <w:p>
+      <w:r>
+        <w:br w:type="page"/>
+      </w:r>
+    </w:p>
+    <w:p>
+      <w:pPr>
+        <w:pStyle w:val="Heading1"/>
+      </w:pPr>
+      <w:r>
+        <w:t>11. 3D Environment Scanning</w:t>
+      </w:r>
+    </w:p>
+    <w:p>
+      <w:pPr>
+        <w:pStyle w:val="Heading2"/>
+      </w:pPr>
+      <w:r>
+        <w:t>Point Cloud Capture</w:t>
+      </w:r>
+    </w:p>
+    <w:p>
+      <w:r>
+        <w:t>The environment scan creates a 3D point cloud of your venue using depth estimation.</w:t>
+        <w:br/>
+        <w:br/>
+        <w:t>Step-by-step:</w:t>
+        <w:br/>
+        <w:t>1. Position and calibrate 2+ cameras (Stage Map required)</w:t>
+        <w:br/>
+        <w:t>2. Go to Settings &gt; Space &gt; "Start Scan"</w:t>
+        <w:br/>
+        <w:t>3. Each camera captures a snapshot, the CV Engine runs Depth-Anything-V2 locally</w:t>
+        <w:br/>
+        <w:t>4. Point clouds from each camera are transformed to stage coordinates and merged</w:t>
+        <w:br/>
+        <w:t>5. Floor is auto-detected and normalized to Z=0</w:t>
+        <w:br/>
+        <w:br/>
+        <w:t>Result: 5,000-20,000 colored 3D points representing your venue geometry.</w:t>
+      </w:r>
+    </w:p>
+    <w:p>
+      <w:pPr>
+        <w:pStyle w:val="Heading2"/>
+      </w:pPr>
+      <w:r>
+        <w:t>Surface Detection</w:t>
+      </w:r>
+    </w:p>
+    <w:p>
+      <w:r>
+        <w:t>After scanning, click "Analyze Surfaces" to run RANSAC-based detection:</w:t>
+        <w:br/>
+        <w:br/>
+        <w:t>- Floor: Horizontal plane detection (normal near vertical)</w:t>
+        <w:br/>
+        <w:t>- Walls: Vertical planes along stage boundaries</w:t>
+        <w:br/>
+        <w:t>- Obstacles: Clustered points that don't belong to floor or walls (pillars, furniture)</w:t>
+        <w:br/>
+        <w:br/>
+        <w:t>Detected surfaces are used by the calibration system to predict where beams land and by the structured-light refinement to verify 3D accuracy.</w:t>
+      </w:r>
+    </w:p>
+    <w:p>
+      <w:pPr>
+        <w:pStyle w:val="Heading2"/>
+      </w:pPr>
+      <w:r>
+        <w:t>CV Engine</w:t>
+      </w:r>
+    </w:p>
+    <w:p>
+      <w:r>
+        <w:t>All computer vision processing runs on the orchestrator PC, not the camera hardware. The CV Engine wraps three model pipelines:</w:t>
+        <w:br/>
+        <w:br/>
+        <w:t>- Beam Detection: Fast color-filtered bright spot detection (&lt;100ms)</w:t>
+        <w:br/>
+        <w:t>- Depth Estimation: Depth-Anything-V2 monocular depth (1-2s on x86)</w:t>
+        <w:br/>
+        <w:t>- Object Detection: YOLOv8n for person/object detection (100-200ms)</w:t>
+        <w:br/>
+        <w:br/>
+        <w:t>Camera nodes only provide JPEG snapshots. This means any camera works — even a Raspberry Pi 3 that can't run ONNX models locally.</w:t>
+      </w:r>
+    </w:p>
+    <w:p>
+      <w:pPr>
+        <w:jc w:val="center"/>
+      </w:pPr>
+      <w:r>
+        <w:drawing>
+          <wp:inline xmlns:a="http://schemas.openxmlformats.org/drawingml/2006/main" xmlns:pic="http://schemas.openxmlformats.org/drawingml/2006/picture">
+            <wp:extent cx="5486400" cy="3429000"/>
+            <wp:docPr id="19" name="Picture 19"/>
+            <wp:cNvGraphicFramePr>
+              <a:graphicFrameLocks noChangeAspect="1"/>
+            </wp:cNvGraphicFramePr>
+            <a:graphic>
+              <a:graphicData uri="http://schemas.openxmlformats.org/drawingml/2006/picture">
+                <pic:pic>
+                  <pic:nvPicPr>
+                    <pic:cNvPr id="0" name="spa-settings-cameras.png"/>
+                    <pic:cNvPicPr/>
+                  </pic:nvPicPr>
+                  <pic:blipFill>
+                    <a:blip r:embed="rId26"/>
+                    <a:stretch>
+                      <a:fillRect/>
+                    </a:stretch>
+                  </pic:blipFill>
+                  <pic:spPr>
+                    <a:xfrm>
+                      <a:off x="0" y="0"/>
+                      <a:ext cx="5486400" cy="3429000"/>
+                    </a:xfrm>
+                    <a:prstGeom prst="rect"/>
+                  </pic:spPr>
+                </pic:pic>
+              </a:graphicData>
+            </a:graphic>
+          </wp:inline>
+        </w:drawing>
+      </w:r>
+    </w:p>
+    <w:p>
+      <w:pPr>
+        <w:jc w:val="center"/>
+      </w:pPr>
+      <w:r>
+        <w:rPr>
+          <w:i/>
+          <w:color w:val="64748B"/>
+          <w:sz w:val="18"/>
+        </w:rPr>
+        <w:t>CV Engine status — model loading state in Settings</w:t>
+      </w:r>
+    </w:p>
+    <w:p>
+      <w:r>
+        <w:br w:type="page"/>
+      </w:r>
+    </w:p>
+    <w:p>
+      <w:pPr>
+        <w:pStyle w:val="Heading1"/>
+      </w:pPr>
+      <w:r>
+        <w:t>12. Stereo 3D &amp; Light Mapping</w:t>
+      </w:r>
+    </w:p>
+    <w:p>
+      <w:pPr>
+        <w:pStyle w:val="Heading2"/>
+      </w:pPr>
+      <w:r>
+        <w:t>Stereo Triangulation</w:t>
+      </w:r>
+    </w:p>
+    <w:p>
+      <w:r>
+        <w:t>With 2+ calibrated cameras, the stereo engine triangulates 3D points from pixel observations. Each camera converts a pixel to a 3D ray; the intersection of rays from different cameras gives the 3D position in stage mm.</w:t>
+        <w:br/>
+        <w:br/>
+        <w:t>Use cases:</w:t>
+        <w:br/>
+        <w:t>- Verify fixture positions by observing them from multiple cameras</w:t>
+        <w:br/>
+        <w:t>- Track moving objects (people) in 3D</w:t>
+        <w:br/>
+        <w:t>- Cross-validate depth estimation against triangulated ground truth</w:t>
+        <w:br/>
+        <w:br/>
+        <w:t>Accuracy depends on camera baseline (distance between cameras) and calibration quality. Typical error: 20-100mm at 3-5m distance with 60° FOV cameras.</w:t>
+      </w:r>
+    </w:p>
+    <w:p>
+      <w:pPr>
+        <w:pStyle w:val="Heading2"/>
+      </w:pPr>
+      <w:r>
+        <w:t>Per-Fixture Light Maps</w:t>
+      </w:r>
+    </w:p>
+    <w:p>
+      <w:r>
+        <w:t>A light map records where each moving head's beam lands at every pan/tilt position in real stage coordinates.</w:t>
+        <w:br/>
+        <w:br/>
+        <w:t>Step-by-step:</w:t>
+        <w:br/>
+        <w:t>1. Calibrate the fixture (mover calibration wizard)</w:t>
+        <w:br/>
+        <w:t>2. Click "Build Light Map" on the fixture</w:t>
+        <w:br/>
+        <w:t>3. The system sweeps the beam across the visible area in a grid pattern</w:t>
+        <w:br/>
+        <w:t>4. At each position: detect beam pixel, convert to stage mm via homography</w:t>
+        <w:br/>
+        <w:t>5. Result: (pan, tilt) → (stageX, stageY, stageZ) lookup table</w:t>
+        <w:br/>
+        <w:br/>
+        <w:t>Inverse lookup: given a target position on stage, find the exact pan/tilt to aim there. Uses inverse-distance weighted interpolation of the 4 nearest samples.</w:t>
+      </w:r>
+    </w:p>
+    <w:p>
+      <w:pPr>
+        <w:pStyle w:val="Heading2"/>
+      </w:pPr>
+      <w:r>
+        <w:t>Beam-as-Structured-Light</w:t>
+      </w:r>
+    </w:p>
+    <w:p>
+      <w:r>
+        <w:t>During calibration sweeps, each beam position that hits a surface provides a definite 3D contact point. These points refine the environment model:</w:t>
+        <w:br/>
+        <w:br/>
+        <w:t>- Floor height correction: Beam contacts adjust the detected floor Z value</w:t>
+        <w:br/>
+        <w:t>- Wall boundary extension: Contacts outside known wall boundaries expand the model</w:t>
+        <w:br/>
+        <w:t>- Surface verification: Predicted ray-surface intersections are compared with observed positions</w:t>
+        <w:br/>
+        <w:br/>
+        <w:t>This is more accurate than depth estimation alone because the beam position is precise (bright centroid) and the ray direction is known (from pan/tilt geometry).</w:t>
+      </w:r>
+    </w:p>
+    <w:p>
+      <w:r>
+        <w:br w:type="page"/>
+      </w:r>
+    </w:p>
+    <w:p>
+      <w:pPr>
+        <w:pStyle w:val="Heading1"/>
+      </w:pPr>
+      <w:r>
+        <w:t>13. Project Files</w:t>
+      </w:r>
+    </w:p>
+    <w:p>
+      <w:pPr>
+        <w:pStyle w:val="Heading2"/>
+      </w:pPr>
+      <w:r>
+        <w:t>Export</w:t>
+      </w:r>
+    </w:p>
+    <w:p>
+      <w:r>
+        <w:t>File &gt; Export saves your entire project as a .slyshow file containing:</w:t>
+        <w:br/>
+        <w:br/>
+        <w:t>- All fixtures, children, layout positions, and stage dimensions</w:t>
+        <w:br/>
+        <w:t>- Actions, spatial effects, timelines, and show playlist</w:t>
+        <w:br/>
+        <w:t>- DMX settings, fixture profiles, and calibration data</w:t>
+        <w:br/>
+        <w:t>- Camera calibrations (intrinsics, stage maps, mover grids)</w:t>
+        <w:br/>
+        <w:t>- Point cloud (gzip-compressed for portability)</w:t>
+        <w:br/>
+        <w:t>- Light maps (per-fixture pan/tilt-to-stage lookup tables)</w:t>
+        <w:br/>
+        <w:br/>
+        <w:t>The project file uses schema version 2. Files from older versions (v1) import successfully — new spatial fields default to empty.</w:t>
+      </w:r>
+    </w:p>
+    <w:p>
+      <w:pPr>
+        <w:pStyle w:val="Heading2"/>
+      </w:pPr>
+      <w:r>
+        <w:t>Import</w:t>
+      </w:r>
+    </w:p>
+    <w:p>
+      <w:r>
+        <w:t>File &gt; Import loads a .slyshow file, replacing all current state:</w:t>
+        <w:br/>
+        <w:br/>
+        <w:t>1. All playback is stopped</w:t>
+        <w:br/>
+        <w:t>2. Fixtures, actions, timelines, and objects are restored</w:t>
+        <w:br/>
+        <w:t>3. Calibration data (homographies, grids, light maps) is restored</w:t>
+        <w:br/>
+        <w:t>4. Point cloud is decompressed and loaded into the 3D viewport</w:t>
+        <w:br/>
+        <w:t>5. Camera SSH passwords must be re-entered (not portable between machines)</w:t>
+        <w:br/>
+        <w:br/>
+        <w:t>This enables a workflow where a designer builds the show on their laptop, exports the project, and a runtime operator loads it on the show PC — all spatial data transfers automatically.</w:t>
+      </w:r>
+    </w:p>
+    <w:p>
+      <w:pPr>
+        <w:pStyle w:val="Heading2"/>
+      </w:pPr>
+      <w:r>
+        <w:t>Spatial Data in Projects</w:t>
+      </w:r>
+    </w:p>
+    <w:p>
+      <w:r>
+        <w:t>Point clouds can be 10,000-20,000 points (1-3 MB uncompressed). The export pipeline gzip-compresses the point array to ~200-500 KB. On import, the compressed data is automatically decompressed and loaded.</w:t>
+        <w:br/>
+        <w:br/>
+        <w:t>Light maps (typically 200-300 samples per fixture) are stored alongside mover calibration data.</w:t>
+      </w:r>
+    </w:p>
+    <w:p>
+      <w:r>
+        <w:br w:type="page"/>
+      </w:r>
+    </w:p>
+    <w:p>
+      <w:pPr>
+        <w:pStyle w:val="Heading1"/>
+      </w:pPr>
+      <w:r>
+        <w:t>14. System Limits</w:t>
       </w:r>
     </w:p>
     <w:tbl>
@@ -3204,7 +3725,7 @@
         <w:pStyle w:val="Heading1"/>
       </w:pPr>
       <w:r>
-        <w:t>11. Troubleshooting</w:t>
+        <w:t>15. Troubleshooting</w:t>
       </w:r>
     </w:p>
     <w:p>
@@ -3308,7 +3829,7 @@
         <w:pStyle w:val="Heading1"/>
       </w:pPr>
       <w:r>
-        <w:t>12. API Quick Reference</w:t>
+        <w:t>16. API Quick Reference</w:t>
       </w:r>
     </w:p>
     <w:p>
@@ -4112,6 +4633,707 @@
       </w:tr>
     </w:tbl>
     <w:p/>
+    <w:p>
+      <w:pPr>
+        <w:pStyle w:val="Heading2"/>
+      </w:pPr>
+      <w:r>
+        <w:t>Calibration</w:t>
+      </w:r>
+    </w:p>
+    <w:tbl>
+      <w:tblPr>
+        <w:tblStyle w:val="LightGrid-Accent1"/>
+        <w:tblW w:type="auto" w:w="0"/>
+        <w:jc w:val="center"/>
+        <w:tblLook w:firstColumn="1" w:firstRow="1" w:lastColumn="0" w:lastRow="0" w:noHBand="0" w:noVBand="1" w:val="04A0"/>
+      </w:tblPr>
+      <w:tblGrid>
+        <w:gridCol w:w="2880"/>
+        <w:gridCol w:w="2880"/>
+        <w:gridCol w:w="2880"/>
+      </w:tblGrid>
+      <w:tr>
+        <w:tc>
+          <w:tcPr>
+            <w:tcW w:type="dxa" w:w="2880"/>
+          </w:tcPr>
+          <w:p>
+            <w:r>
+              <w:rPr>
+                <w:b/>
+              </w:rPr>
+              <w:t>Method</w:t>
+            </w:r>
+          </w:p>
+        </w:tc>
+        <w:tc>
+          <w:tcPr>
+            <w:tcW w:type="dxa" w:w="2880"/>
+          </w:tcPr>
+          <w:p>
+            <w:r>
+              <w:rPr>
+                <w:b/>
+              </w:rPr>
+              <w:t>Endpoint</w:t>
+            </w:r>
+          </w:p>
+        </w:tc>
+        <w:tc>
+          <w:tcPr>
+            <w:tcW w:type="dxa" w:w="2880"/>
+          </w:tcPr>
+          <w:p>
+            <w:r>
+              <w:rPr>
+                <w:b/>
+              </w:rPr>
+              <w:t>Description</w:t>
+            </w:r>
+          </w:p>
+        </w:tc>
+      </w:tr>
+      <w:tr>
+        <w:tc>
+          <w:tcPr>
+            <w:tcW w:type="dxa" w:w="2880"/>
+          </w:tcPr>
+          <w:p>
+            <w:r>
+              <w:t>POST</w:t>
+            </w:r>
+          </w:p>
+        </w:tc>
+        <w:tc>
+          <w:tcPr>
+            <w:tcW w:type="dxa" w:w="2880"/>
+          </w:tcPr>
+          <w:p>
+            <w:r>
+              <w:t>/api/cameras/:id/aruco/capture</w:t>
+            </w:r>
+          </w:p>
+        </w:tc>
+        <w:tc>
+          <w:tcPr>
+            <w:tcW w:type="dxa" w:w="2880"/>
+          </w:tcPr>
+          <w:p>
+            <w:r>
+              <w:t>Capture ArUco frame</w:t>
+            </w:r>
+          </w:p>
+        </w:tc>
+      </w:tr>
+      <w:tr>
+        <w:tc>
+          <w:tcPr>
+            <w:tcW w:type="dxa" w:w="2880"/>
+          </w:tcPr>
+          <w:p>
+            <w:r>
+              <w:t>POST</w:t>
+            </w:r>
+          </w:p>
+        </w:tc>
+        <w:tc>
+          <w:tcPr>
+            <w:tcW w:type="dxa" w:w="2880"/>
+          </w:tcPr>
+          <w:p>
+            <w:r>
+              <w:t>/api/cameras/:id/aruco/compute</w:t>
+            </w:r>
+          </w:p>
+        </w:tc>
+        <w:tc>
+          <w:tcPr>
+            <w:tcW w:type="dxa" w:w="2880"/>
+          </w:tcPr>
+          <w:p>
+            <w:r>
+              <w:t>Compute intrinsics</w:t>
+            </w:r>
+          </w:p>
+        </w:tc>
+      </w:tr>
+      <w:tr>
+        <w:tc>
+          <w:tcPr>
+            <w:tcW w:type="dxa" w:w="2880"/>
+          </w:tcPr>
+          <w:p>
+            <w:r>
+              <w:t>POST</w:t>
+            </w:r>
+          </w:p>
+        </w:tc>
+        <w:tc>
+          <w:tcPr>
+            <w:tcW w:type="dxa" w:w="2880"/>
+          </w:tcPr>
+          <w:p>
+            <w:r>
+              <w:t>/api/cameras/:id/stage-map</w:t>
+            </w:r>
+          </w:p>
+        </w:tc>
+        <w:tc>
+          <w:tcPr>
+            <w:tcW w:type="dxa" w:w="2880"/>
+          </w:tcPr>
+          <w:p>
+            <w:r>
+              <w:t>Compute camera pose</w:t>
+            </w:r>
+          </w:p>
+        </w:tc>
+      </w:tr>
+      <w:tr>
+        <w:tc>
+          <w:tcPr>
+            <w:tcW w:type="dxa" w:w="2880"/>
+          </w:tcPr>
+          <w:p>
+            <w:r>
+              <w:t>POST</w:t>
+            </w:r>
+          </w:p>
+        </w:tc>
+        <w:tc>
+          <w:tcPr>
+            <w:tcW w:type="dxa" w:w="2880"/>
+          </w:tcPr>
+          <w:p>
+            <w:r>
+              <w:t>/api/calibration/mover/:id/start</w:t>
+            </w:r>
+          </w:p>
+        </w:tc>
+        <w:tc>
+          <w:tcPr>
+            <w:tcW w:type="dxa" w:w="2880"/>
+          </w:tcPr>
+          <w:p>
+            <w:r>
+              <w:t>Start mover calibration</w:t>
+            </w:r>
+          </w:p>
+        </w:tc>
+      </w:tr>
+      <w:tr>
+        <w:tc>
+          <w:tcPr>
+            <w:tcW w:type="dxa" w:w="2880"/>
+          </w:tcPr>
+          <w:p>
+            <w:r>
+              <w:t>GET</w:t>
+            </w:r>
+          </w:p>
+        </w:tc>
+        <w:tc>
+          <w:tcPr>
+            <w:tcW w:type="dxa" w:w="2880"/>
+          </w:tcPr>
+          <w:p>
+            <w:r>
+              <w:t>/api/calibration/mover/:id/status</w:t>
+            </w:r>
+          </w:p>
+        </w:tc>
+        <w:tc>
+          <w:tcPr>
+            <w:tcW w:type="dxa" w:w="2880"/>
+          </w:tcPr>
+          <w:p>
+            <w:r>
+              <w:t>Poll calibration progress</w:t>
+            </w:r>
+          </w:p>
+        </w:tc>
+      </w:tr>
+      <w:tr>
+        <w:tc>
+          <w:tcPr>
+            <w:tcW w:type="dxa" w:w="2880"/>
+          </w:tcPr>
+          <w:p>
+            <w:r>
+              <w:t>POST</w:t>
+            </w:r>
+          </w:p>
+        </w:tc>
+        <w:tc>
+          <w:tcPr>
+            <w:tcW w:type="dxa" w:w="2880"/>
+          </w:tcPr>
+          <w:p>
+            <w:r>
+              <w:t>/api/calibration/stereo/calibrate</w:t>
+            </w:r>
+          </w:p>
+        </w:tc>
+        <w:tc>
+          <w:tcPr>
+            <w:tcW w:type="dxa" w:w="2880"/>
+          </w:tcPr>
+          <w:p>
+            <w:r>
+              <w:t>Build stereo engine</w:t>
+            </w:r>
+          </w:p>
+        </w:tc>
+      </w:tr>
+      <w:tr>
+        <w:tc>
+          <w:tcPr>
+            <w:tcW w:type="dxa" w:w="2880"/>
+          </w:tcPr>
+          <w:p>
+            <w:r>
+              <w:t>POST</w:t>
+            </w:r>
+          </w:p>
+        </w:tc>
+        <w:tc>
+          <w:tcPr>
+            <w:tcW w:type="dxa" w:w="2880"/>
+          </w:tcPr>
+          <w:p>
+            <w:r>
+              <w:t>/api/calibration/stereo/triangulate</w:t>
+            </w:r>
+          </w:p>
+        </w:tc>
+        <w:tc>
+          <w:tcPr>
+            <w:tcW w:type="dxa" w:w="2880"/>
+          </w:tcPr>
+          <w:p>
+            <w:r>
+              <w:t>Triangulate 3D point</w:t>
+            </w:r>
+          </w:p>
+        </w:tc>
+      </w:tr>
+    </w:tbl>
+    <w:p/>
+    <w:p>
+      <w:pPr>
+        <w:pStyle w:val="Heading2"/>
+      </w:pPr>
+      <w:r>
+        <w:t>CV Engine</w:t>
+      </w:r>
+    </w:p>
+    <w:tbl>
+      <w:tblPr>
+        <w:tblStyle w:val="LightGrid-Accent1"/>
+        <w:tblW w:type="auto" w:w="0"/>
+        <w:jc w:val="center"/>
+        <w:tblLook w:firstColumn="1" w:firstRow="1" w:lastColumn="0" w:lastRow="0" w:noHBand="0" w:noVBand="1" w:val="04A0"/>
+      </w:tblPr>
+      <w:tblGrid>
+        <w:gridCol w:w="2880"/>
+        <w:gridCol w:w="2880"/>
+        <w:gridCol w:w="2880"/>
+      </w:tblGrid>
+      <w:tr>
+        <w:tc>
+          <w:tcPr>
+            <w:tcW w:type="dxa" w:w="2880"/>
+          </w:tcPr>
+          <w:p>
+            <w:r>
+              <w:rPr>
+                <w:b/>
+              </w:rPr>
+              <w:t>Method</w:t>
+            </w:r>
+          </w:p>
+        </w:tc>
+        <w:tc>
+          <w:tcPr>
+            <w:tcW w:type="dxa" w:w="2880"/>
+          </w:tcPr>
+          <w:p>
+            <w:r>
+              <w:rPr>
+                <w:b/>
+              </w:rPr>
+              <w:t>Endpoint</w:t>
+            </w:r>
+          </w:p>
+        </w:tc>
+        <w:tc>
+          <w:tcPr>
+            <w:tcW w:type="dxa" w:w="2880"/>
+          </w:tcPr>
+          <w:p>
+            <w:r>
+              <w:rPr>
+                <w:b/>
+              </w:rPr>
+              <w:t>Description</w:t>
+            </w:r>
+          </w:p>
+        </w:tc>
+      </w:tr>
+      <w:tr>
+        <w:tc>
+          <w:tcPr>
+            <w:tcW w:type="dxa" w:w="2880"/>
+          </w:tcPr>
+          <w:p>
+            <w:r>
+              <w:t>GET</w:t>
+            </w:r>
+          </w:p>
+        </w:tc>
+        <w:tc>
+          <w:tcPr>
+            <w:tcW w:type="dxa" w:w="2880"/>
+          </w:tcPr>
+          <w:p>
+            <w:r>
+              <w:t>/api/cv/status</w:t>
+            </w:r>
+          </w:p>
+        </w:tc>
+        <w:tc>
+          <w:tcPr>
+            <w:tcW w:type="dxa" w:w="2880"/>
+          </w:tcPr>
+          <w:p>
+            <w:r>
+              <w:t>Model loading status</w:t>
+            </w:r>
+          </w:p>
+        </w:tc>
+      </w:tr>
+      <w:tr>
+        <w:tc>
+          <w:tcPr>
+            <w:tcW w:type="dxa" w:w="2880"/>
+          </w:tcPr>
+          <w:p>
+            <w:r>
+              <w:t>POST</w:t>
+            </w:r>
+          </w:p>
+        </w:tc>
+        <w:tc>
+          <w:tcPr>
+            <w:tcW w:type="dxa" w:w="2880"/>
+          </w:tcPr>
+          <w:p>
+            <w:r>
+              <w:t>/api/cameras/:id/detect</w:t>
+            </w:r>
+          </w:p>
+        </w:tc>
+        <w:tc>
+          <w:tcPr>
+            <w:tcW w:type="dxa" w:w="2880"/>
+          </w:tcPr>
+          <w:p>
+            <w:r>
+              <w:t>Object detection (local)</w:t>
+            </w:r>
+          </w:p>
+        </w:tc>
+      </w:tr>
+      <w:tr>
+        <w:tc>
+          <w:tcPr>
+            <w:tcW w:type="dxa" w:w="2880"/>
+          </w:tcPr>
+          <w:p>
+            <w:r>
+              <w:t>POST</w:t>
+            </w:r>
+          </w:p>
+        </w:tc>
+        <w:tc>
+          <w:tcPr>
+            <w:tcW w:type="dxa" w:w="2880"/>
+          </w:tcPr>
+          <w:p>
+            <w:r>
+              <w:t>/api/cameras/:id/depth</w:t>
+            </w:r>
+          </w:p>
+        </w:tc>
+        <w:tc>
+          <w:tcPr>
+            <w:tcW w:type="dxa" w:w="2880"/>
+          </w:tcPr>
+          <w:p>
+            <w:r>
+              <w:t>Depth estimation (local)</w:t>
+            </w:r>
+          </w:p>
+        </w:tc>
+      </w:tr>
+      <w:tr>
+        <w:tc>
+          <w:tcPr>
+            <w:tcW w:type="dxa" w:w="2880"/>
+          </w:tcPr>
+          <w:p>
+            <w:r>
+              <w:t>POST</w:t>
+            </w:r>
+          </w:p>
+        </w:tc>
+        <w:tc>
+          <w:tcPr>
+            <w:tcW w:type="dxa" w:w="2880"/>
+          </w:tcPr>
+          <w:p>
+            <w:r>
+              <w:t>/api/cameras/:id/beam-detect</w:t>
+            </w:r>
+          </w:p>
+        </w:tc>
+        <w:tc>
+          <w:tcPr>
+            <w:tcW w:type="dxa" w:w="2880"/>
+          </w:tcPr>
+          <w:p>
+            <w:r>
+              <w:t>Beam detection (local)</w:t>
+            </w:r>
+          </w:p>
+        </w:tc>
+      </w:tr>
+    </w:tbl>
+    <w:p/>
+    <w:p>
+      <w:pPr>
+        <w:pStyle w:val="Heading2"/>
+      </w:pPr>
+      <w:r>
+        <w:t>Space</w:t>
+      </w:r>
+    </w:p>
+    <w:tbl>
+      <w:tblPr>
+        <w:tblStyle w:val="LightGrid-Accent1"/>
+        <w:tblW w:type="auto" w:w="0"/>
+        <w:jc w:val="center"/>
+        <w:tblLook w:firstColumn="1" w:firstRow="1" w:lastColumn="0" w:lastRow="0" w:noHBand="0" w:noVBand="1" w:val="04A0"/>
+      </w:tblPr>
+      <w:tblGrid>
+        <w:gridCol w:w="2880"/>
+        <w:gridCol w:w="2880"/>
+        <w:gridCol w:w="2880"/>
+      </w:tblGrid>
+      <w:tr>
+        <w:tc>
+          <w:tcPr>
+            <w:tcW w:type="dxa" w:w="2880"/>
+          </w:tcPr>
+          <w:p>
+            <w:r>
+              <w:rPr>
+                <w:b/>
+              </w:rPr>
+              <w:t>Method</w:t>
+            </w:r>
+          </w:p>
+        </w:tc>
+        <w:tc>
+          <w:tcPr>
+            <w:tcW w:type="dxa" w:w="2880"/>
+          </w:tcPr>
+          <w:p>
+            <w:r>
+              <w:rPr>
+                <w:b/>
+              </w:rPr>
+              <w:t>Endpoint</w:t>
+            </w:r>
+          </w:p>
+        </w:tc>
+        <w:tc>
+          <w:tcPr>
+            <w:tcW w:type="dxa" w:w="2880"/>
+          </w:tcPr>
+          <w:p>
+            <w:r>
+              <w:rPr>
+                <w:b/>
+              </w:rPr>
+              <w:t>Description</w:t>
+            </w:r>
+          </w:p>
+        </w:tc>
+      </w:tr>
+      <w:tr>
+        <w:tc>
+          <w:tcPr>
+            <w:tcW w:type="dxa" w:w="2880"/>
+          </w:tcPr>
+          <w:p>
+            <w:r>
+              <w:t>POST</w:t>
+            </w:r>
+          </w:p>
+        </w:tc>
+        <w:tc>
+          <w:tcPr>
+            <w:tcW w:type="dxa" w:w="2880"/>
+          </w:tcPr>
+          <w:p>
+            <w:r>
+              <w:t>/api/space/scan</w:t>
+            </w:r>
+          </w:p>
+        </w:tc>
+        <w:tc>
+          <w:tcPr>
+            <w:tcW w:type="dxa" w:w="2880"/>
+          </w:tcPr>
+          <w:p>
+            <w:r>
+              <w:t>Start point cloud scan</w:t>
+            </w:r>
+          </w:p>
+        </w:tc>
+      </w:tr>
+      <w:tr>
+        <w:tc>
+          <w:tcPr>
+            <w:tcW w:type="dxa" w:w="2880"/>
+          </w:tcPr>
+          <w:p>
+            <w:r>
+              <w:t>GET</w:t>
+            </w:r>
+          </w:p>
+        </w:tc>
+        <w:tc>
+          <w:tcPr>
+            <w:tcW w:type="dxa" w:w="2880"/>
+          </w:tcPr>
+          <w:p>
+            <w:r>
+              <w:t>/api/space</w:t>
+            </w:r>
+          </w:p>
+        </w:tc>
+        <w:tc>
+          <w:tcPr>
+            <w:tcW w:type="dxa" w:w="2880"/>
+          </w:tcPr>
+          <w:p>
+            <w:r>
+              <w:t>Get point cloud</w:t>
+            </w:r>
+          </w:p>
+        </w:tc>
+      </w:tr>
+      <w:tr>
+        <w:tc>
+          <w:tcPr>
+            <w:tcW w:type="dxa" w:w="2880"/>
+          </w:tcPr>
+          <w:p>
+            <w:r>
+              <w:t>POST</w:t>
+            </w:r>
+          </w:p>
+        </w:tc>
+        <w:tc>
+          <w:tcPr>
+            <w:tcW w:type="dxa" w:w="2880"/>
+          </w:tcPr>
+          <w:p>
+            <w:r>
+              <w:t>/api/space/analyze</w:t>
+            </w:r>
+          </w:p>
+        </w:tc>
+        <w:tc>
+          <w:tcPr>
+            <w:tcW w:type="dxa" w:w="2880"/>
+          </w:tcPr>
+          <w:p>
+            <w:r>
+              <w:t>Detect surfaces</w:t>
+            </w:r>
+          </w:p>
+        </w:tc>
+      </w:tr>
+      <w:tr>
+        <w:tc>
+          <w:tcPr>
+            <w:tcW w:type="dxa" w:w="2880"/>
+          </w:tcPr>
+          <w:p>
+            <w:r>
+              <w:t>GET</w:t>
+            </w:r>
+          </w:p>
+        </w:tc>
+        <w:tc>
+          <w:tcPr>
+            <w:tcW w:type="dxa" w:w="2880"/>
+          </w:tcPr>
+          <w:p>
+            <w:r>
+              <w:t>/api/project/export</w:t>
+            </w:r>
+          </w:p>
+        </w:tc>
+        <w:tc>
+          <w:tcPr>
+            <w:tcW w:type="dxa" w:w="2880"/>
+          </w:tcPr>
+          <w:p>
+            <w:r>
+              <w:t>Export project (with spatial data)</w:t>
+            </w:r>
+          </w:p>
+        </w:tc>
+      </w:tr>
+      <w:tr>
+        <w:tc>
+          <w:tcPr>
+            <w:tcW w:type="dxa" w:w="2880"/>
+          </w:tcPr>
+          <w:p>
+            <w:r>
+              <w:t>POST</w:t>
+            </w:r>
+          </w:p>
+        </w:tc>
+        <w:tc>
+          <w:tcPr>
+            <w:tcW w:type="dxa" w:w="2880"/>
+          </w:tcPr>
+          <w:p>
+            <w:r>
+              <w:t>/api/project/import</w:t>
+            </w:r>
+          </w:p>
+        </w:tc>
+        <w:tc>
+          <w:tcPr>
+            <w:tcW w:type="dxa" w:w="2880"/>
+          </w:tcPr>
+          <w:p>
+            <w:r>
+              <w:t>Import project</w:t>
+            </w:r>
+          </w:p>
+        </w:tc>
+      </w:tr>
+    </w:tbl>
+    <w:p/>
     <w:sectPr>
       <w:pgSz w:w="12240" w:h="15840"/>
       <w:pgMar w:top="1440" w:right="1800" w:bottom="1440" w:left="1800" w:header="720" w:footer="720" w:gutter="0"/>

</xml_diff>